<commit_message>
Add weight-sensitivity finding to the IEEE report and supporting evidence
- NRF_Report_IEEE_v3.docx: one paragraph at the end of Section VI-B ("Two
  independent failures of the composite") reporting that no weighting
  satisfies both falsification tests.
- NRF_Supporting_Evidence_v3.docx: new Section 4.6 (post-hoc weight-sensitivity
  analysis) with a results table; Future Work re-weighting item and the
  reproduction commands updated to match.

Co-Authored-By: Claude Opus 5.5 <noreply@anthropic.com>
Claude-Session: https://claude.ai/code/session_01EJuYUTnyMnJBfVyrhL8Ahu
</commit_message>
<xml_diff>
--- a/NRF_Report_IEEE_v3.docx
+++ b/NRF_Report_IEEE_v3.docx
@@ -780,22 +780,7 @@
           <w:szCs w:val="16"/>
         </w:rPr>
         <w:t xml:space="preserve">TABLE I</w:t>
-      </w:r>
-      <w:r>
-        <w:rPr>
-          <w:rFonts w:ascii="Times New Roman" w:cs="Times New Roman" w:eastAsia="Times New Roman" w:hAnsi="Times New Roman"/>
-          <w:sz w:val="16"/>
-          <w:szCs w:val="16"/>
-        </w:rPr>
         <w:br/>
-        <w:t xml:space="preserve"/>
-      </w:r>
-      <w:r>
-        <w:rPr>
-          <w:rFonts w:ascii="Times New Roman" w:cs="Times New Roman" w:eastAsia="Times New Roman" w:hAnsi="Times New Roman"/>
-          <w:sz w:val="16"/>
-          <w:szCs w:val="16"/>
-        </w:rPr>
         <w:t xml:space="preserve">BASELINE RELIABILITY PROFILE (N = 50)</w:t>
       </w:r>
     </w:p>
@@ -1335,22 +1320,7 @@
           <w:szCs w:val="16"/>
         </w:rPr>
         <w:t xml:space="preserve">TABLE II</w:t>
-      </w:r>
-      <w:r>
-        <w:rPr>
-          <w:rFonts w:ascii="Times New Roman" w:cs="Times New Roman" w:eastAsia="Times New Roman" w:hAnsi="Times New Roman"/>
-          <w:sz w:val="16"/>
-          <w:szCs w:val="16"/>
-        </w:rPr>
         <w:br/>
-        <w:t xml:space="preserve"/>
-      </w:r>
-      <w:r>
-        <w:rPr>
-          <w:rFonts w:ascii="Times New Roman" w:cs="Times New Roman" w:eastAsia="Times New Roman" w:hAnsi="Times New Roman"/>
-          <w:sz w:val="16"/>
-          <w:szCs w:val="16"/>
-        </w:rPr>
         <w:t xml:space="preserve">ERROR CATEGORIES WITH CONFIRMED INSTANCES</w:t>
       </w:r>
     </w:p>
@@ -1958,22 +1928,7 @@
           <w:szCs w:val="16"/>
         </w:rPr>
         <w:t xml:space="preserve">TABLE III</w:t>
-      </w:r>
-      <w:r>
-        <w:rPr>
-          <w:rFonts w:ascii="Times New Roman" w:cs="Times New Roman" w:eastAsia="Times New Roman" w:hAnsi="Times New Roman"/>
-          <w:sz w:val="16"/>
-          <w:szCs w:val="16"/>
-        </w:rPr>
         <w:br/>
-        <w:t xml:space="preserve"/>
-      </w:r>
-      <w:r>
-        <w:rPr>
-          <w:rFonts w:ascii="Times New Roman" w:cs="Times New Roman" w:eastAsia="Times New Roman" w:hAnsi="Times New Roman"/>
-          <w:sz w:val="16"/>
-          <w:szCs w:val="16"/>
-        </w:rPr>
         <w:t xml:space="preserve">DETECTOR SENSITIVITY BY INJECTION ROUTE (N = 10)</w:t>
       </w:r>
     </w:p>
@@ -2581,22 +2536,7 @@
           <w:szCs w:val="16"/>
         </w:rPr>
         <w:t xml:space="preserve">TABLE IV</w:t>
-      </w:r>
-      <w:r>
-        <w:rPr>
-          <w:rFonts w:ascii="Times New Roman" w:cs="Times New Roman" w:eastAsia="Times New Roman" w:hAnsi="Times New Roman"/>
-          <w:sz w:val="16"/>
-          <w:szCs w:val="16"/>
-        </w:rPr>
         <w:br/>
-        <w:t xml:space="preserve"/>
-      </w:r>
-      <w:r>
-        <w:rPr>
-          <w:rFonts w:ascii="Times New Roman" w:cs="Times New Roman" w:eastAsia="Times New Roman" w:hAnsi="Times New Roman"/>
-          <w:sz w:val="16"/>
-          <w:szCs w:val="16"/>
-        </w:rPr>
         <w:t xml:space="preserve">CALIBRATION AND OVERCONFIDENCE (N = 50)</w:t>
       </w:r>
     </w:p>
@@ -3152,22 +3092,7 @@
           <w:szCs w:val="16"/>
         </w:rPr>
         <w:t xml:space="preserve">TABLE V</w:t>
-      </w:r>
-      <w:r>
-        <w:rPr>
-          <w:rFonts w:ascii="Times New Roman" w:cs="Times New Roman" w:eastAsia="Times New Roman" w:hAnsi="Times New Roman"/>
-          <w:sz w:val="16"/>
-          <w:szCs w:val="16"/>
-        </w:rPr>
         <w:br/>
-        <w:t xml:space="preserve"/>
-      </w:r>
-      <w:r>
-        <w:rPr>
-          <w:rFonts w:ascii="Times New Roman" w:cs="Times New Roman" w:eastAsia="Times New Roman" w:hAnsi="Times New Roman"/>
-          <w:sz w:val="16"/>
-          <w:szCs w:val="16"/>
-        </w:rPr>
         <w:t xml:space="preserve">METRIC RESPONSE TO GRADED CONTEXT NOISE (N = 50 PER LEVEL)</w:t>
       </w:r>
     </w:p>
@@ -4183,22 +4108,7 @@
           <w:szCs w:val="16"/>
         </w:rPr>
         <w:t xml:space="preserve">TABLE VI</w:t>
-      </w:r>
-      <w:r>
-        <w:rPr>
-          <w:rFonts w:ascii="Times New Roman" w:cs="Times New Roman" w:eastAsia="Times New Roman" w:hAnsi="Times New Roman"/>
-          <w:sz w:val="16"/>
-          <w:szCs w:val="16"/>
-        </w:rPr>
         <w:br/>
-        <w:t xml:space="preserve"/>
-      </w:r>
-      <w:r>
-        <w:rPr>
-          <w:rFonts w:ascii="Times New Roman" w:cs="Times New Roman" w:eastAsia="Times New Roman" w:hAnsi="Times New Roman"/>
-          <w:sz w:val="16"/>
-          <w:szCs w:val="16"/>
-        </w:rPr>
         <w:t xml:space="preserve">COMPARATIVE BASELINES ON IDENTICAL DATA (N = 50)</w:t>
       </w:r>
     </w:p>
@@ -4939,22 +4849,7 @@
           <w:szCs w:val="16"/>
         </w:rPr>
         <w:t xml:space="preserve">TABLE VII</w:t>
-      </w:r>
-      <w:r>
-        <w:rPr>
-          <w:rFonts w:ascii="Times New Roman" w:cs="Times New Roman" w:eastAsia="Times New Roman" w:hAnsi="Times New Roman"/>
-          <w:sz w:val="16"/>
-          <w:szCs w:val="16"/>
-        </w:rPr>
         <w:br/>
-        <w:t xml:space="preserve"/>
-      </w:r>
-      <w:r>
-        <w:rPr>
-          <w:rFonts w:ascii="Times New Roman" w:cs="Times New Roman" w:eastAsia="Times New Roman" w:hAnsi="Times New Roman"/>
-          <w:sz w:val="16"/>
-          <w:szCs w:val="16"/>
-        </w:rPr>
         <w:t xml:space="preserve">PUBLISHED FINQA EXECUTION ACCURACY</w:t>
       </w:r>
     </w:p>
@@ -5407,6 +5302,21 @@
           <w:szCs w:val="20"/>
         </w:rPr>
         <w:t xml:space="preserve">The ranking inversion in Section V-E is a second and independent failure. It does not depend on correlation analysis or on sample size: one configuration is unambiguously more accurate than another on the same items under the same scorer, and the composite orders them the wrong way. Together these establish that the aggregate is unfit as a summary measure in this configuration. The degeneracy is a property of the confidence signal rather than of the weighting alone; logit-derived confidence [15] varies with input difficulty and would not collapse in this manner, whereas prompted self-assessment [16] evidently can. Three revisions follow: replace prompted confidence with a probability-derived signal, re-weight or orthogonalise so accuracy is not double-counted, and report components alongside any aggregate.</w:t>
+      </w:r>
+    </w:p>
+    <w:p>
+      <w:pPr>
+        <w:spacing w:after="60" w:line="240"/>
+        <w:ind w:firstLine="288"/>
+        <w:jc w:val="both"/>
+      </w:pPr>
+      <w:r>
+        <w:rPr>
+          <w:rFonts w:ascii="Times New Roman" w:cs="Times New Roman" w:eastAsia="Times New Roman" w:hAnsi="Times New Roman"/>
+          <w:sz w:val="20"/>
+          <w:szCs w:val="20"/>
+        </w:rPr>
+        <w:t xml:space="preserve">Neither failure is an artefact of the chosen weights. The recorded component values from Sections V-D and V-E were re-scored post hoc under every weighting on a 0.05 grid over the four weights, 1,771 vectors each summing to one, with no new generations. A weighting was counted as tracking noise if its correlation with noise level was at most −0.5, and as ranking correctly if it ordered oracle above retrieval above closed-book. Of all weightings, 19.2% track noise and 43.5% rank correctly, but none does both. Every weighting that tracks noise places at most 0.35 of its total weight on accuracy and calibration combined, whereas every weighting that ranks correctly places at least 0.50 there. The oracle condition scores lower on precisely the two components that respond to noise, NESS and hallucination rate (Table VI), so its advantage is visible only through terms that do not respond to noise at this sample size. Among correctly ranking weightings the strongest achievable noise correlation is −0.16, and the result is unchanged on a 0.01 grid. Re-weighting is therefore necessary but not sufficient: the components themselves must change. Because the sweep selects and evaluates on the same fifty-item conditions, this should be confirmed on a larger held-out run.</w:t>
       </w:r>
     </w:p>
     <w:p>

</xml_diff>

<commit_message>
Word reports: replace the weight-sweep and defect paragraphs with the corrected findings; add the larger re-run (Section 4.8)
Co-Authored-By: Claude Sonnet 5.5 <noreply@anthropic.com>
Claude-Session: https://claude.ai/code/session_01EJuYUTnyMnJBfVyrhL8Ahu
</commit_message>
<xml_diff>
--- a/NRF_Report_IEEE_v3.docx
+++ b/NRF_Report_IEEE_v3.docx
@@ -5316,7 +5316,7 @@
           <w:sz w:val="20"/>
           <w:szCs w:val="20"/>
         </w:rPr>
-        <w:t xml:space="preserve">Neither failure is an artefact of the chosen weights. The recorded component values from Sections V-D and V-E were re-scored post hoc under every weighting on a 0.05 grid over the four weights, 1,771 vectors each summing to one, with no new generations. A weighting was counted as tracking noise if its correlation with noise level was at most −0.5, and as ranking correctly if it ordered oracle above retrieval above closed-book. Of all weightings, 19.2% track noise and 43.5% rank correctly, but none does both. Every weighting that tracks noise places at most 0.35 of its total weight on accuracy and calibration combined, whereas every weighting that ranks correctly places at least 0.50 there. The oracle condition scores lower on precisely the two components that respond to noise, NESS and hallucination rate (Table VI), so its advantage is visible only through terms that do not respond to noise at this sample size. Among correctly ranking weightings the strongest achievable noise correlation is −0.16, and the result is unchanged on a 0.01 grid. Re-weighting is therefore necessary but not sufficient: the components themselves must change. Because the sweep selects and evaluates on the same fifty-item conditions, this should be confirmed on a larger held-out run.</w:t>
+        <w:t xml:space="preserve">The weight analysis above should not be read as settled. It re-scored the recorded component values under 1,771 weightings, but those values come from five noise levels of fifty items each, and a larger re-run with the corrected scorer shows that the outcome is dominated by sampling noise: for the same model, 0.0% of weightings passed both tests on the development run and 41.2% on the test run.</w:t>
       </w:r>
     </w:p>
     <w:p>
@@ -5331,7 +5331,7 @@
           <w:sz w:val="20"/>
           <w:szCs w:val="20"/>
         </w:rPr>
-        <w:t xml:space="preserve">A scoring defect found after these runs qualifies some of the figures above. The evidence-support score counted the number in the model’s own “Confidence: 0.9” statement as one the retrieved text had to support, which it never could, so every response was marked down slightly and some were pushed below the hallucination threshold by that number alone. The scorer now excludes it, and the saved responses were re-scored without new generations. All four strict-mode hallucination flags in Experiment 1, and all four in Experiment 2, were caused by the defect, so the doubling of the hallucination rate under evidence injection (0.10 to 0.20) does not survive. In Experiment 5 the ranking inversion survives as a near tie, 0.6224 for retrieval against 0.6211 for oracle evidence, down from a gap of 0.0080. Experiment 4 did not save its responses, so its correction is bracketed rather than exact: the correlation of noise with hallucination rate (+0.76) lies between +0.00 and +0.89, the correlation of the default-weight composite with noise (−0.10) between +0.18 and −0.36, and in every bracketing scenario no weighting passes both tests. A full-precision CPU re-run of all five experiments with the corrected scorer then measured these directly. Noise against hallucination rate was −0.12, so the earlier relation did not replicate, and noise against the composite was +0.62, so the composite still does not track noise. Accuracy fell from 0.34 to 0.20 from numeric precision alone, and a 4-bit GPU re-run would complete the comparison.</w:t>
+        <w:t xml:space="preserve">Two corrections qualify the results above. First, a scoring defect: the evidence-support score counted the model’s own “Confidence: 0.9” as an unsupported number. Corrected, the Experiment 2 rise in hallucination rate (0.10 to 0.20) disappears and the Experiment 1 strict hallucination rate falls from 0.08 to 0.00. Second, a larger re-run with the corrected scorer (Qwen2.5-3B on 150 development and 150 test items, Qwen2.5-1.5B on 100 and 100, and sampled seeds) found that the Experiment 4 noise sentences do not degrade the model at all (paired accuracy change +0.007, 95% CI −0.05 to +0.07), so a flat composite under them is not evidence about the metric, and that the five-level correlation is unstable (+0.09 on development, −0.64 on test). When a manipulation that does degrade the model is used, replacing numbers in the retrieved evidence with wrong ones, accuracy falls from 0.22 to about 0.03 and the composite falls with it (r = −0.97 on development, −0.93 on test), but evidence support measured against the evidence shown does not change (+0.004) while support measured against the clean evidence falls by 0.36. The composite’s sensitivity therefore comes from accuracy and the accuracy-driven calibration term, and the gold-free evidence measures cannot detect corrupted evidence. The claims in this report that the composite fails to track degradation in general, that the hallucination flag tracks noise, and that no weighting rescues the composite are withdrawn; the structural argument stands.</w:t>
       </w:r>
     </w:p>
     <w:p>

</xml_diff>